<commit_message>
Attribute Heaton citations to contributing authors of the edited volume
Co-Authored-By: Claude Sonnet 5.5 <noreply@anthropic.com>
Claude-Session: https://claude.ai/code/session_01GuPG1GkPxQRMAjcW62QkGT
</commit_message>
<xml_diff>
--- a/Amina_v_Farouk_Talaq_Answer.docx
+++ b/Amina_v_Farouk_Talaq_Answer.docx
@@ -66,7 +66,7 @@
         <w:pStyle w:val="BodyText"/>
       </w:pPr>
       <w:r>
-        <w:t xml:space="preserve">A note on sources. I treat the Divorce Amendment Act 1 of 2024 as the scenario describes it, namely as bringing Muslim marriages within the Divorce Act. Section numbers and any transitional provisions of the Amendment Act should be checked against the statute. Heaton’s</w:t>
+        <w:t xml:space="preserve">A note on sources. I treat the Divorce Amendment Act 1 of 2024 as the scenario describes it, namely as bringing Muslim marriages within the Divorce Act. Section numbers and any transitional provisions of the Amendment Act should be checked against the statute. The prescribed text, J Heaton (ed)</w:t>
       </w:r>
       <w:r>
         <w:t xml:space="preserve"> </w:t>
@@ -82,7 +82,7 @@
         <w:t xml:space="preserve"> </w:t>
       </w:r>
       <w:r>
-        <w:t xml:space="preserve">(Juta 2014) is the prescribed text. It pre-dates the</w:t>
+        <w:t xml:space="preserve">(Juta 2014), is an edited collection: Part 1 (civil marriage and civil union, including the patrimonial chapter by Heaton herself), Part 2 (customary marriages, Himonga) and Part 3 (religious marriages, Muslim and Hindu, by N Moosa and C Rautenbach) are written by different authors, so I cite the contributing author together with the editor. The book pre-dates the</w:t>
       </w:r>
       <w:r>
         <w:t xml:space="preserve"> </w:t>
@@ -132,7 +132,7 @@
         <w:pStyle w:val="FirstParagraph"/>
       </w:pPr>
       <w:r>
-        <w:t xml:space="preserve">At common law a marriage is dissolved only by the death of a spouse or by a court decree of divorce (Heaton</w:t>
+        <w:t xml:space="preserve">At common law a marriage is dissolved only by the death of a spouse or by a court decree of divorce (see Part 1 of J Heaton (ed)</w:t>
       </w:r>
       <w:r>
         <w:t xml:space="preserve"> </w:t>
@@ -148,7 +148,7 @@
         <w:t xml:space="preserve"> </w:t>
       </w:r>
       <w:r>
-        <w:t xml:space="preserve">(2014) [chapter/page to be added from your copy]). Islamic marriages were for most of the twentieth century not regarded as valid marriages. Courts refused them recognition on the ground that they were potentially polygynous and so contrary to the</w:t>
+        <w:t xml:space="preserve">(Juta 2014) on the Divorce Act; pinpoint to be added from your copy). Islamic marriages were for most of the twentieth century not regarded as valid marriages. Courts refused them recognition on the ground that they were potentially polygynous and so contrary to the</w:t>
       </w:r>
       <w:r>
         <w:t xml:space="preserve"> </w:t>
@@ -410,7 +410,7 @@
         <w:pStyle w:val="FirstParagraph"/>
       </w:pPr>
       <w:r>
-        <w:t xml:space="preserve">The Divorce Act is structured around judicial dissolution. Section 3 provides that a court may grant a decree of divorce. Section 4 sets out the single ground for divorce on which a decree may be granted, namely irretrievable breakdown of the marriage, which the court must find on the evidence. Sections 6 and 7 regulate the consequences: s 6 requires the court to be satisfied that satisfactory arrangements have been made for the welfare of minor or dependent children, and s 7 empowers the court to make orders on maintenance, forfeiture and, where applicable, redistribution of assets under s 7(3). Section 5A deals with religious or similar barriers to remarriage (Heaton [chapter/page to be added]). Each of these provisions assumes that a court is the dissolving authority. The decree is a judgment that alters status with effect against the world. The protective provisions of the Act are triggered only by the proceedings that produce it.</w:t>
+        <w:t xml:space="preserve">The Divorce Act is structured around judicial dissolution. Section 3 provides that a court may grant a decree of divorce. Section 4 sets out the single ground for divorce on which a decree may be granted, namely irretrievable breakdown of the marriage, which the court must find on the evidence. Sections 6 and 7 regulate the consequences: s 6 requires the court to be satisfied that satisfactory arrangements have been made for the welfare of minor or dependent children, and s 7 empowers the court to make orders on maintenance, forfeiture and, where applicable, redistribution of assets under s 7(3). Section 5A deals with religious or similar barriers to remarriage (Part 1 of Heaton (ed); on how religious marriages are treated, Moosa and Rautenbach in Part 3; pinpoints to be added). Each of these provisions assumes that a court is the dissolving authority. The decree is a judgment that alters status with effect against the world. The protective provisions of the Act are triggered only by the proceedings that produce it.</w:t>
       </w:r>
     </w:p>
     <w:p>
@@ -1072,7 +1072,7 @@
         <w:pStyle w:val="FirstParagraph"/>
       </w:pPr>
       <w:r>
-        <w:t xml:space="preserve">The literature on the recognition and regulation of Muslim marriages in South Africa is substantial. Among the writers whose work is commonly cited are Waheeda Amien, Najma Moosa, Elsje Bonthuys and Christa Rautenbach, together with the standard family-law texts, including Heaton. Precise references should be taken from the prescribed readings. The following challenges recur.</w:t>
+        <w:t xml:space="preserve">The literature on the recognition and regulation of Muslim marriages in South Africa is substantial. Among the writers whose work is commonly cited are Waheeda Amien, Najma Moosa, Elsje Bonthuys and Christa Rautenbach, together with the standard family-law texts. Moosa and Rautenbach, who wrote Part 3 of Heaton (ed) on the dissolution of Muslim and Hindu marriages, are the most directly relevant contributors in the prescribed book. Precise references should be taken from the prescribed readings. The following challenges recur.</w:t>
       </w:r>
     </w:p>
     <w:bookmarkStart w:id="42" w:name="X25bafdc4857c1519c4043ddba030e207a879212"/>
@@ -1344,7 +1344,7 @@
         <w:t xml:space="preserve">Women’s Legal Centre Trust</w:t>
       </w:r>
       <w:r>
-        <w:t xml:space="preserve">, is therefore of practical importance. It is the principal means by which a wife who has contributed to the household, but whose husband holds the assets, can obtain an equitable share. Heaton’s discussion of the court’s approach to redistribution in marriages out of community of property [chapter/page to be added] is the starting point for how it would be applied. Whether the Amendment Act applies s 7(3) directly or by a modified route should be confirmed from the text.</w:t>
+        <w:t xml:space="preserve">, is therefore of practical importance. It is the principal means by which a wife who has contributed to the household, but whose husband holds the assets, can obtain an equitable share. Heaton’s chapter on the patrimonial consequences of divorce (Chapter 4 of Heaton (ed)) discusses redistribution, and notes the debate about the constitutionality of s 7(3) itself, so the redistribution route should be presented as the available mechanism rather than an uncontested one [pinpoint to be added] is the starting point for how it would be applied. Whether the Amendment Act applies s 7(3) directly or by a modified route should be confirmed from the text.</w:t>
       </w:r>
     </w:p>
     <w:bookmarkEnd w:id="49"/>
@@ -2127,7 +2127,7 @@
         <w:pStyle w:val="Compact"/>
       </w:pPr>
       <w:r>
-        <w:t xml:space="preserve">Heaton, J</w:t>
+        <w:t xml:space="preserve">Heaton, J (ed)</w:t>
       </w:r>
       <w:r>
         <w:t xml:space="preserve"> </w:t>
@@ -2143,7 +2143,35 @@
         <w:t xml:space="preserve"> </w:t>
       </w:r>
       <w:r>
-        <w:t xml:space="preserve">(Juta, Cape Town 2014) (1st ed), pinpoint references to be added from your copy.</w:t>
+        <w:t xml:space="preserve">(Juta, Cape Town 2014) (1st ed). Relevant contributors: Moosa, N and Rautenbach, C (Part 3, religious marriages); Himonga, C (Part 2, customary marriages); Sonnekus, JC (Chapter 3, personal consequences of divorce, including occupation of the matrimonial home); Heaton, J (Chapter 4, patrimonial consequences); Catto, A (jurisdiction, procedure and costs, including Rule 43); De Jong, M (mediation). Pinpoint references to be added from your copy.</w:t>
+      </w:r>
+    </w:p>
+    <w:p>
+      <w:pPr>
+        <w:numPr>
+          <w:ilvl w:val="0"/>
+          <w:numId w:val="1003"/>
+        </w:numPr>
+        <w:pStyle w:val="Compact"/>
+      </w:pPr>
+      <w:r>
+        <w:t xml:space="preserve">Kruuse, H book review of Heaton (ed) (2015) 40(1)</w:t>
+      </w:r>
+      <w:r>
+        <w:t xml:space="preserve"> </w:t>
+      </w:r>
+      <w:r>
+        <w:rPr>
+          <w:iCs/>
+          <w:i/>
+        </w:rPr>
+        <w:t xml:space="preserve">Journal for Juridical Science</w:t>
+      </w:r>
+      <w:r>
+        <w:t xml:space="preserve"> </w:t>
+      </w:r>
+      <w:r>
+        <w:t xml:space="preserve">69-74 (for the structure and authorship of the book).</w:t>
       </w:r>
     </w:p>
     <w:p>

</xml_diff>

<commit_message>
Add Sonnekus and Himonga references from Heaton (ed)
Co-Authored-By: Claude Sonnet 5.5 <noreply@anthropic.com>
Claude-Session: https://claude.ai/code/session_01GuPG1GkPxQRMAjcW62QkGT
</commit_message>
<xml_diff>
--- a/Amina_v_Farouk_Talaq_Answer.docx
+++ b/Amina_v_Farouk_Talaq_Answer.docx
@@ -616,7 +616,7 @@
         <w:pStyle w:val="BodyText"/>
       </w:pPr>
       <w:r>
-        <w:t xml:space="preserve">Amina’s continued occupation of the home is also protected. Section 26(3) of the Constitution provides that no one may be evicted from their home, or have their home demolished, without an order of court made after considering all the relevant circumstances. A talaq cannot oust her.</w:t>
+        <w:t xml:space="preserve">Amina’s continued occupation of the home is also protected. Section 26(3) of the Constitution provides that no one may be evicted from their home, or have their home demolished, without an order of court made after considering all the relevant circumstances. A talaq cannot oust her. Sonnekus’s chapter on the personal consequences of divorce in Heaton (ed) (Chapter 3) deals with claims to continued occupation of the former matrimonial home. It shows that these are matters for the court to regulate on divorce, which is a further reason why the issue cannot be settled by private repudiation [pinpoint to be added].</w:t>
       </w:r>
     </w:p>
     <w:bookmarkEnd w:id="30"/>
@@ -1476,6 +1476,14 @@
       </w:pPr>
       <w:r>
         <w:t xml:space="preserve">Farouk’s pronouncement is strong evidence that the marriage has broken down irretrievably for the purposes of s 4. The court should dismiss or decline the declaratory application, but it should allow him to institute divorce proceedings, or allow the application to be amended and converted into one, so that the matter proceeds under the Divorce Act with the full range of ancillary relief for Amina and any children. This is a practical way of giving Farouk what he is entitled to, a legal end to a marriage that has failed, without giving him what he is not entitled to, an unregulated and unilateral one.</w:t>
+      </w:r>
+    </w:p>
+    <w:p>
+      <w:pPr>
+        <w:pStyle w:val="BodyText"/>
+      </w:pPr>
+      <w:r>
+        <w:t xml:space="preserve">Himonga’s chapter on customary marriages in Heaton (ed) (Part 2) supports the idea that the Divorce Act’s concepts, including irretrievable breakdown, can be applied to a non-civil marriage in a way that is sensitive to its own character. By analogy, a court applying s 4 to a Muslim marriage may consider the parties’ religious practices when assessing breakdown without surrendering the court’s control over the decree [pinpoint to be added].</w:t>
       </w:r>
     </w:p>
     <w:bookmarkEnd w:id="55"/>

</xml_diff>